<commit_message>
Update Worksheet1.docx: label stack top in trace table, explain Stack implementation
</commit_message>
<xml_diff>
--- a/worksheet1/Worksheet1.docx
+++ b/worksheet1/Worksheet1.docx
@@ -3753,6 +3753,24 @@
     <w:p>
       <w:pPr>
         <w:pStyle w:val="BodyText"/>
+        <w:spacing w:before="80"/>
+        <w:ind w:left="383" w:right="275"/>
+        <w:rPr>
+          <w:rFonts w:ascii="DejaVu Sans" w:hAnsi="DejaVu Sans" w:cs="DejaVu Sans"/>
+        </w:rPr>
+      </w:pPr>
+      <w:r>
+        <w:rPr>
+          <w:rFonts w:ascii="DejaVu Sans" w:eastAsia="DejaVu Sans" w:hAnsi="DejaVu Sans" w:cs="DejaVu Sans"/>
+          <w:color w:val="1F3A93"/>
+          <w:lang w:val="en"/>
+        </w:rPr>
+        <w:t xml:space="preserve">My implementation: I preallocated the list to the capacity ([None] * capacity) instead of starting with data = [], so push writes at index top and the list never grows; pop puts None back in the slot. The attributes are named _data, _top and _capacity rather than data, top and max_size. Behaviour follows the steps: push raises OverflowError when top + 1 reaches the capacity, pop and peek raise IndexError when empty, and length is top + 1. The trade-off is a fixed capacity, which is why the other exercises size their stacks from the input, for example Stack(capacity=len(s)).</w:t>
+      </w:r>
+    </w:p>
+    <w:p>
+      <w:pPr>
+        <w:pStyle w:val="BodyText"/>
         <w:spacing w:before="94"/>
       </w:pPr>
     </w:p>
@@ -7661,7 +7679,7 @@
                 <w:spacing w:val="-2"/>
                 <w:sz w:val="19"/>
               </w:rPr>
-              <w:t>structure</w:t>
+              <w:t>structure (stack, top first)</w:t>
             </w:r>
           </w:p>
         </w:tc>

</xml_diff>